<commit_message>
docs: finalize comprehensive legal suite and statutory registration profile for Need2Done multi-service ecosystem
</commit_message>
<xml_diff>
--- a/docs/NEED2DONE_LAUNCH/01_BUSINESS_REGISTRATION_&_LICENSES/Need2Done_Official_Business_Registration_Details.docx
+++ b/docs/NEED2DONE_LAUNCH/01_BUSINESS_REGISTRATION_&_LICENSES/Need2Done_Official_Business_Registration_Details.docx
@@ -128,7 +128,7 @@
               <w:rPr>
                 <w:sz w:val="17"/>
               </w:rPr>
-              <w:t>[NA — To be entered by Applicant during submission]</w:t>
+              <w:t>[NA — To be entered by Applicant during form submission]</w:t>
             </w:r>
           </w:p>
         </w:tc>
@@ -157,7 +157,7 @@
               <w:rPr>
                 <w:sz w:val="17"/>
               </w:rPr>
-              <w:t>Need2Done (Alternative: Need2Done Services)</w:t>
+              <w:t>Need2Done (Alternative: Need2Done Technologies / Need2Done Services)</w:t>
             </w:r>
           </w:p>
         </w:tc>
@@ -186,7 +186,7 @@
               <w:rPr>
                 <w:sz w:val="17"/>
               </w:rPr>
-              <w:t>Sole Proprietorship (or Partnership / Pvt Ltd as applicable)</w:t>
+              <w:t>Sole Proprietorship (or Partnership / LLP / Pvt Ltd as applicable)</w:t>
             </w:r>
           </w:p>
         </w:tc>
@@ -215,7 +215,7 @@
               <w:rPr>
                 <w:sz w:val="17"/>
               </w:rPr>
-              <w:t>Services / Technology Platform / E-Commerce Intermediary</w:t>
+              <w:t>Services / Technology Platform / Hyperlocal E-Commerce Intermediary</w:t>
             </w:r>
           </w:p>
         </w:tc>
@@ -231,7 +231,7 @@
                 <w:b/>
                 <w:sz w:val="17"/>
               </w:rPr>
-              <w:t>Primary NIC Code (MSME / GST)</w:t>
+              <w:t>Primary NIC Codes (MSME / GST)</w:t>
             </w:r>
           </w:p>
         </w:tc>
@@ -244,7 +244,7 @@
               <w:rPr>
                 <w:sz w:val="17"/>
               </w:rPr>
-              <w:t>63112 / 63999 (Web portals &amp; ITeS) &amp; 96099 (Other personal services)</w:t>
+              <w:t>63112 / 63999 (Web portals &amp; ITeS), 96099 (Other personal services), 53200 (Courier / delivery)</w:t>
             </w:r>
           </w:p>
         </w:tc>
@@ -289,7 +289,7 @@
                 <w:b/>
                 <w:sz w:val="17"/>
               </w:rPr>
-              <w:t>Official Contact Number</w:t>
+              <w:t>Official Contact Helpline</w:t>
             </w:r>
           </w:p>
         </w:tc>
@@ -318,7 +318,7 @@
                 <w:b/>
                 <w:sz w:val="17"/>
               </w:rPr>
-              <w:t>Platform Access Channels</w:t>
+              <w:t>Official Support Channels</w:t>
             </w:r>
           </w:p>
         </w:tc>
@@ -356,7 +356,7 @@
         <w:spacing w:line="276" w:lineRule="auto"/>
       </w:pPr>
       <w:r>
-        <w:t>Information Technology Enabled Services (ITeS) &amp; Online Hyperlocal Marketplace Intermediary connecting local residential customers with verified independent delivery runners and domestic service helpers across three foundational verticals: Home Services, Medicine Delivery, and Custom Work.</w:t>
+        <w:t>Information Technology Enabled Services (ITeS) &amp; Multi-Category Hyperlocal Marketplace Intermediary connecting local residential customers with verified independent delivery partners, runners, and domestic service providers across Home Services, Medicine Delivery, Custom Work &amp; Errands, Food &amp; Grocery fulfillment, and Fresh Produce logistics via automated digital channels (WhatsApp Bot &amp; Web Portals).</w:t>
       </w:r>
     </w:p>
     <w:p>
@@ -377,7 +377,7 @@
         <w:spacing w:line="276" w:lineRule="auto"/>
       </w:pPr>
       <w:r>
-        <w:t>Need2Done is a technology-driven hyperlocal convenience platform providing on-demand household chores, deep cleaning, personal domestic assistance, urgent medicine collection, and custom errand services through automated digital channels (WhatsApp Business Bot &amp; Web Platform). The platform acts strictly as a digital intermediary facilitating instant booking, dispatching, live order updates, and secure digital payment settlements between customers and verified local service partners.</w:t>
+        <w:t>Need2Done is a technology-driven multi-service hyperlocal convenience platform facilitating on-demand domestic support, residential deep cleaning, prescription pharmacy pickup, custom errand execution, food delivery, and daily essential procurement. Operating strictly as a digital intermediary under Section 79 of the Information Technology Act, 2000, Need2Done provides real-time GPS dispatching, automated order lifecycle tracking, and secure digital payment processing connecting consumers with local merchants and independent service partners.</w:t>
       </w:r>
     </w:p>
     <w:p>
@@ -390,7 +390,7 @@
           <w:color w:val="022B5E"/>
           <w:sz w:val="22"/>
         </w:rPr>
-        <w:t>4. Core Active Service Verticals (3 Pillars)</w:t>
+        <w:t>4. Comprehensive Multi-Service Verticals</w:t>
       </w:r>
     </w:p>
     <w:p>
@@ -402,10 +402,10 @@
         <w:rPr>
           <w:b/>
         </w:rPr>
-        <w:t xml:space="preserve">1. Home Services: </w:t>
+        <w:t xml:space="preserve">1. Home Services (HS): </w:t>
       </w:r>
       <w:r>
-        <w:t>Professional on-demand residential assistance including Home Deep Cleaning, Kitchen Cleaning, Bathroom Cleaning &amp; Sanitization, Dishwashing, Laundry &amp; Ironing, and Fan/Window Cleaning by verified helpers.</w:t>
+        <w:t>On-demand domestic assistance including Home Deep Cleaning, Kitchen Cleaning, Bathroom Cleaning &amp; Sanitization, Dishwashing, Laundry &amp; Ironing, and Fan/Window Cleaning by verified helpers.</w:t>
       </w:r>
     </w:p>
     <w:p>
@@ -417,10 +417,10 @@
         <w:rPr>
           <w:b/>
         </w:rPr>
-        <w:t xml:space="preserve">2. Medicine Delivery: </w:t>
+        <w:t xml:space="preserve">2. Medicine Delivery (Medi): </w:t>
       </w:r>
       <w:r>
-        <w:t>Doorstep delivery of prescription medicines and OTC wellness products collected from licensed local retail pharmacies against valid prescription uploads. (Delivery intermediary only).</w:t>
+        <w:t>Doorstep collection and delivery of prescription medications and OTC wellness products from licensed local retail pharmacies against valid customer prescription uploads.</w:t>
       </w:r>
     </w:p>
     <w:p>
@@ -432,33 +432,70 @@
         <w:rPr>
           <w:b/>
         </w:rPr>
-        <w:t xml:space="preserve">3. Custom Work: </w:t>
+        <w:t xml:space="preserve">3. Custom Work &amp; Errands: </w:t>
       </w:r>
       <w:r>
-        <w:t>Tailor-made local errands, custom task execution, document/item pickup and delivery, queue standing, and personalized domestic assistance on customer demand.</w:t>
+        <w:t>On-demand personalized errands, custom tasks, item/document pick-and-drop, queue standing, and tailored domestic assistance requested by customers.</w:t>
       </w:r>
     </w:p>
     <w:p>
       <w:pPr>
-        <w:spacing w:before="240" w:after="60"/>
+        <w:pStyle w:val="ListBullet"/>
+        <w:spacing w:after="40"/>
       </w:pPr>
       <w:r>
         <w:rPr>
           <w:b/>
-          <w:color w:val="FF7D00"/>
-          <w:sz w:val="22"/>
         </w:rPr>
-        <w:t>5. Operational Scope &amp; Upcoming Services Notice</w:t>
+        <w:t xml:space="preserve">4. Food Delivery: </w:t>
+      </w:r>
+      <w:r>
+        <w:t>Ordering and doorstep delivery of prepared meals and beverages from local restaurants and food vendors.</w:t>
       </w:r>
     </w:p>
     <w:p>
       <w:pPr>
-        <w:ind w:left="288"/>
+        <w:pStyle w:val="ListBullet"/>
+        <w:spacing w:after="40"/>
       </w:pPr>
       <w:r>
-        <w:t>• Handyman &amp; Repair Scope: General Handyman &amp; Heavy Structural Trades (electrical rewiring, pipe plumbing overhauls, carpentry) are NOT standard catalog listings. Minor assistance is undertaken strictly under Custom Work / Special Requirement.</w:t>
-        <w:br/>
-        <w:t>• Upcoming Services Rollouts: Full-scale General Handyman, Appliance Repair, Grocery Fulfilment, and Specialized Trade Maintenance will be launched in upcoming expansion phases.</w:t>
+        <w:rPr>
+          <w:b/>
+        </w:rPr>
+        <w:t xml:space="preserve">5. Grocery Delivery: </w:t>
+      </w:r>
+      <w:r>
+        <w:t>Procurement and delivery of daily household groceries and packaged goods from neighborhood supermarkets.</w:t>
+      </w:r>
+    </w:p>
+    <w:p>
+      <w:pPr>
+        <w:pStyle w:val="ListBullet"/>
+        <w:spacing w:after="40"/>
+      </w:pPr>
+      <w:r>
+        <w:rPr>
+          <w:b/>
+        </w:rPr>
+        <w:t xml:space="preserve">6. Fruits &amp; Vegetables: </w:t>
+      </w:r>
+      <w:r>
+        <w:t>Collection and delivery of fresh farm produce and greens from local retail mandis and fresh produce vendors.</w:t>
+      </w:r>
+    </w:p>
+    <w:p>
+      <w:pPr>
+        <w:pStyle w:val="ListBullet"/>
+        <w:spacing w:after="40"/>
+      </w:pPr>
+      <w:r>
+        <w:rPr>
+          <w:b/>
+        </w:rPr>
+        <w:t xml:space="preserve">7. Mobility &amp; Rides: </w:t>
+      </w:r>
+      <w:r>
+        <w:t>Point-to-point urban mobility and commuter transport services (where locally permitted and licensed).</w:t>
       </w:r>
     </w:p>
     <w:sectPr>

</xml_diff>

<commit_message>
docs: update official website to https://need2done.in, helpline +91 7989862623, and support email across all legal documents
</commit_message>
<xml_diff>
--- a/docs/NEED2DONE_LAUNCH/01_BUSINESS_REGISTRATION_&_LICENSES/Need2Done_Official_Business_Registration_Details.docx
+++ b/docs/NEED2DONE_LAUNCH/01_BUSINESS_REGISTRATION_&_LICENSES/Need2Done_Official_Business_Registration_Details.docx
@@ -273,7 +273,7 @@
               <w:rPr>
                 <w:sz w:val="17"/>
               </w:rPr>
-              <w:t>https://need2done.in/home-services/</w:t>
+              <w:t>https://need2done.in</w:t>
             </w:r>
           </w:p>
         </w:tc>
@@ -303,6 +303,35 @@
                 <w:sz w:val="17"/>
               </w:rPr>
               <w:t>+91 7989862623</w:t>
+            </w:r>
+          </w:p>
+        </w:tc>
+      </w:tr>
+      <w:tr>
+        <w:tc>
+          <w:tcPr>
+            <w:tcW w:type="dxa" w:w="4968"/>
+          </w:tcPr>
+          <w:p>
+            <w:r>
+              <w:rPr>
+                <w:b/>
+                <w:sz w:val="17"/>
+              </w:rPr>
+              <w:t>Official Support Email</w:t>
+            </w:r>
+          </w:p>
+        </w:tc>
+        <w:tc>
+          <w:tcPr>
+            <w:tcW w:type="dxa" w:w="4968"/>
+          </w:tcPr>
+          <w:p>
+            <w:r>
+              <w:rPr>
+                <w:sz w:val="17"/>
+              </w:rPr>
+              <w:t>support@need2done.in</w:t>
             </w:r>
           </w:p>
         </w:tc>

</xml_diff>

<commit_message>
docs: clearly categorize Active Services (HS, CW, MEDI) vs Future Services (FD, Groce, Fruit & Veg, Ride) across all registration and legal documents
</commit_message>
<xml_diff>
--- a/docs/NEED2DONE_LAUNCH/01_BUSINESS_REGISTRATION_&_LICENSES/Need2Done_Official_Business_Registration_Details.docx
+++ b/docs/NEED2DONE_LAUNCH/01_BUSINESS_REGISTRATION_&_LICENSES/Need2Done_Official_Business_Registration_Details.docx
@@ -385,7 +385,7 @@
         <w:spacing w:line="276" w:lineRule="auto"/>
       </w:pPr>
       <w:r>
-        <w:t>Information Technology Enabled Services (ITeS) &amp; Multi-Category Hyperlocal Marketplace Intermediary connecting local residential customers with verified independent delivery partners, runners, and domestic service providers across Home Services, Medicine Delivery, Custom Work &amp; Errands, Food &amp; Grocery fulfillment, and Fresh Produce logistics via automated digital channels (WhatsApp Bot &amp; Web Portals).</w:t>
+        <w:t>Information Technology Enabled Services (ITeS) &amp; Hyperlocal Marketplace Intermediary connecting local residential customers with verified independent delivery partners, runners, and domestic service providers. Currently operational across Home Services (HS), Custom Work (CW), and Medicine Delivery (MEDI), with planned future rollouts for Food Delivery (FD), Grocery Delivery, Fruits &amp; Vegetables, and Rides / Mobility.</w:t>
       </w:r>
     </w:p>
     <w:p>
@@ -406,7 +406,7 @@
         <w:spacing w:line="276" w:lineRule="auto"/>
       </w:pPr>
       <w:r>
-        <w:t>Need2Done is a technology-driven multi-service hyperlocal convenience platform facilitating on-demand domestic support, residential deep cleaning, prescription pharmacy pickup, custom errand execution, food delivery, and daily essential procurement. Operating strictly as a digital intermediary under Section 79 of the Information Technology Act, 2000, Need2Done provides real-time GPS dispatching, automated order lifecycle tracking, and secure digital payment processing connecting consumers with local merchants and independent service partners.</w:t>
+        <w:t>Need2Done is a technology-driven multi-service hyperlocal convenience platform facilitating on-demand domestic assistance, residential deep cleaning, prescription pharmacy pickup, and custom errand execution. Operating strictly as a digital intermediary under Section 79 of the Information Technology Act, 2000, Need2Done provides real-time GPS dispatching, automated order lifecycle tracking, and secure digital payment processing connecting consumers with local merchants and independent service partners.</w:t>
       </w:r>
     </w:p>
     <w:p>
@@ -419,7 +419,16 @@
           <w:color w:val="022B5E"/>
           <w:sz w:val="22"/>
         </w:rPr>
-        <w:t>4. Comprehensive Multi-Service Verticals</w:t>
+        <w:t>4. Service Framework: Active Services &amp; Future Rollout Roadmap</w:t>
+      </w:r>
+    </w:p>
+    <w:p>
+      <w:r>
+        <w:rPr>
+          <w:b/>
+          <w:color w:val="FF7D00"/>
+        </w:rPr>
+        <w:t>Part A: Currently Active Services (Live Operations)</w:t>
       </w:r>
     </w:p>
     <w:p>
@@ -446,10 +455,10 @@
         <w:rPr>
           <w:b/>
         </w:rPr>
-        <w:t xml:space="preserve">2. Medicine Delivery (Medi): </w:t>
+        <w:t xml:space="preserve">2. Custom Work (CW): </w:t>
       </w:r>
       <w:r>
-        <w:t>Doorstep collection and delivery of prescription medications and OTC wellness products from licensed local retail pharmacies against valid customer prescription uploads.</w:t>
+        <w:t>On-demand personalized errands, custom task execution, item/document pick-and-drop, queue standing, and tailored domestic assistance requested by customers.</w:t>
       </w:r>
     </w:p>
     <w:p>
@@ -461,10 +470,22 @@
         <w:rPr>
           <w:b/>
         </w:rPr>
-        <w:t xml:space="preserve">3. Custom Work &amp; Errands: </w:t>
+        <w:t xml:space="preserve">3. Medicine Delivery (MEDI): </w:t>
       </w:r>
       <w:r>
-        <w:t>On-demand personalized errands, custom tasks, item/document pick-and-drop, queue standing, and tailored domestic assistance requested by customers.</w:t>
+        <w:t>Doorstep collection and delivery of prescription medications and OTC wellness products from licensed local retail pharmacies against valid customer prescription uploads.</w:t>
+      </w:r>
+    </w:p>
+    <w:p>
+      <w:pPr>
+        <w:spacing w:before="120"/>
+      </w:pPr>
+      <w:r>
+        <w:rPr>
+          <w:b/>
+          <w:color w:val="64748B"/>
+        </w:rPr>
+        <w:t>Part B: Upcoming Services (Future Rollout Roadmap)</w:t>
       </w:r>
     </w:p>
     <w:p>
@@ -476,10 +497,10 @@
         <w:rPr>
           <w:b/>
         </w:rPr>
-        <w:t xml:space="preserve">4. Food Delivery: </w:t>
+        <w:t xml:space="preserve">4. Food Delivery (FD): </w:t>
       </w:r>
       <w:r>
-        <w:t>Ordering and doorstep delivery of prepared meals and beverages from local restaurants and food vendors.</w:t>
+        <w:t>Doorstep delivery of prepared meals and beverages from local restaurants and eateries.</w:t>
       </w:r>
     </w:p>
     <w:p>
@@ -491,7 +512,7 @@
         <w:rPr>
           <w:b/>
         </w:rPr>
-        <w:t xml:space="preserve">5. Grocery Delivery: </w:t>
+        <w:t xml:space="preserve">5. Grocery Delivery (Groce): </w:t>
       </w:r>
       <w:r>
         <w:t>Procurement and delivery of daily household groceries and packaged goods from neighborhood supermarkets.</w:t>
@@ -521,7 +542,7 @@
         <w:rPr>
           <w:b/>
         </w:rPr>
-        <w:t xml:space="preserve">7. Mobility &amp; Rides: </w:t>
+        <w:t xml:space="preserve">7. Rides &amp; Mobility (Ride): </w:t>
       </w:r>
       <w:r>
         <w:t>Point-to-point urban mobility and commuter transport services (where locally permitted and licensed).</w:t>

</xml_diff>